<commit_message>
feat: Nang cap KHBD Robotics & Slide Tin hoc Tuan 04 tach rieng 1-1 voi anh AI va 20 layouts
</commit_message>
<xml_diff>
--- a/KHBD_Robotics/Lớp_1/Tuần_02/KHBD_Robotics_Lớp_1_Tiet01_Tiet_0_inh_huong_mon_hoc.docx
+++ b/KHBD_Robotics/Lớp_1/Tuần_02/KHBD_Robotics_Lớp_1_Tiet01_Tiet_0_inh_huong_mon_hoc.docx
@@ -189,7 +189,7 @@
           <w:i w:val="0"/>
           <w:sz w:val="26"/>
         </w:rPr>
-        <w:t>CHỦ ĐIỂM: BỘ THIẾT BỊ: OLLO KINDER</w:t>
+        <w:t>CHỦ ĐIỂM: BỘ THIẾT BỊ: OLLO INITIATE</w:t>
       </w:r>
     </w:p>
     <w:p>
@@ -370,7 +370,7 @@
           <w:i w:val="0"/>
           <w:sz w:val="26"/>
         </w:rPr>
-        <w:t>- NLa (Sử dụng và quản lí các phương tiện ICT): Nhận biết tên gọi, hình dạng, chức năng các chi tiết bộ kit OLLO Kinder. (Đạt được thông qua Hoạt động 2)</w:t>
+        <w:t>- NL5 (Giao tiếp công nghệ): Tự tin thuyết minh nguyên lý hoạt động và giới thiệu sản phẩm robot Tiết 0: Định hướng môn học trước tập thể. (Đạt được thông qua Hoạt động 3, Hoạt động 4)</w:t>
       </w:r>
     </w:p>
     <w:p>
@@ -386,7 +386,7 @@
           <w:i w:val="0"/>
           <w:sz w:val="26"/>
         </w:rPr>
-        <w:t>- NLd (Ứng dụng ICT trong học và tự học): Thực hiện lắp ráp đúng quy trình mô hình Tiết 0: Định hướng môn học. (Đạt được thông qua Hoạt động 3)</w:t>
+        <w:t>- NL4 (Đánh giá công nghệ): Lắng nghe, nhận xét và đánh giá sản phẩm robot của nhóm bạn theo tiêu chí kỹ thuật. (Đạt được thông qua Hoạt động 4)</w:t>
       </w:r>
     </w:p>
     <w:p>
@@ -498,7 +498,7 @@
           <w:i w:val="0"/>
           <w:sz w:val="26"/>
         </w:rPr>
-        <w:t>1. Giáo viên: Bộ Kit Robotics OLLO Kinder mẫu, máy chiếu, slide hướng dẫn lắp ráp Tiết 0: Định hướng môn học, phiếu hướng dẫn thực hành.</w:t>
+        <w:t>1. Giáo viên: Bộ Kit Robotics OLLO Initiate mẫu, máy chiếu, slide hướng dẫn lắp ráp Tiết 0: Định hướng môn học, phiếu hướng dẫn thực hành.</w:t>
       </w:r>
     </w:p>
     <w:p>
@@ -514,7 +514,7 @@
           <w:i w:val="0"/>
           <w:sz w:val="26"/>
         </w:rPr>
-        <w:t>2. Học sinh: Bộ Kit Robotics OLLO Kinder theo nhóm, dụng cụ tháo chốt, vở ghi.</w:t>
+        <w:t>2. Học sinh: Bộ Kit Robotics OLLO Initiate theo nhóm, dụng cụ tháo chốt, vở ghi.</w:t>
       </w:r>
     </w:p>
     <w:p>

</xml_diff>